<commit_message>
Add screenshots and update documentation
Add a new screenshots document (Screenshots Insert, Update, Delete i PREGLED iz aplikacije Najam Plovila.docx) and update the main documentation (Aplikacija za najam plovila dokumentacija.docx). The new file provides UI screenshots for Insert/Update/Delete and overview flows; the main documentation file was modified to incorporate or reference these changes.
</commit_message>
<xml_diff>
--- a/Aplikacija za najam plovila dokumentacija.docx
+++ b/Aplikacija za najam plovila dokumentacija.docx
@@ -246,6 +246,30 @@
           <w:lang w:eastAsia="hr-HR"/>
         </w:rPr>
         <w:t>cijena dnevnog najma</w:t>
+      </w:r>
+    </w:p>
+    <w:p>
+      <w:pPr>
+        <w:numPr>
+          <w:ilvl w:val="0"/>
+          <w:numId w:val="1"/>
+        </w:numPr>
+        <w:spacing w:before="100" w:beforeAutospacing="1" w:after="100" w:afterAutospacing="1" w:line="240" w:lineRule="auto"/>
+        <w:rPr>
+          <w:rFonts w:ascii="Times New Roman" w:eastAsia="Times New Roman" w:hAnsi="Times New Roman" w:cs="Times New Roman"/>
+          <w:sz w:val="24"/>
+          <w:szCs w:val="24"/>
+          <w:lang w:eastAsia="hr-HR"/>
+        </w:rPr>
+      </w:pPr>
+      <w:r>
+        <w:rPr>
+          <w:rFonts w:ascii="Times New Roman" w:eastAsia="Times New Roman" w:hAnsi="Times New Roman" w:cs="Times New Roman"/>
+          <w:sz w:val="24"/>
+          <w:szCs w:val="24"/>
+          <w:lang w:eastAsia="hr-HR"/>
+        </w:rPr>
+        <w:t>datum porinuća plovila</w:t>
       </w:r>
     </w:p>
     <w:p>
@@ -606,7 +630,25 @@
           <w:szCs w:val="20"/>
           <w:lang w:eastAsia="hr-HR"/>
         </w:rPr>
-        <w:t xml:space="preserve">    PLOVILA: '/plovila',</w:t>
+        <w:t xml:space="preserve">    PLOVILA</w:t>
+      </w:r>
+      <w:r>
+        <w:rPr>
+          <w:rFonts w:ascii="Courier New" w:eastAsia="Times New Roman" w:hAnsi="Courier New" w:cs="Courier New"/>
+          <w:sz w:val="20"/>
+          <w:szCs w:val="20"/>
+          <w:lang w:eastAsia="hr-HR"/>
+        </w:rPr>
+        <w:t>_PREGLED</w:t>
+      </w:r>
+      <w:r>
+        <w:rPr>
+          <w:rFonts w:ascii="Courier New" w:eastAsia="Times New Roman" w:hAnsi="Courier New" w:cs="Courier New"/>
+          <w:sz w:val="20"/>
+          <w:szCs w:val="20"/>
+          <w:lang w:eastAsia="hr-HR"/>
+        </w:rPr>
+        <w:t>: '/plovila',</w:t>
       </w:r>
     </w:p>
     <w:p>
@@ -644,7 +686,25 @@
           <w:szCs w:val="20"/>
           <w:lang w:eastAsia="hr-HR"/>
         </w:rPr>
-        <w:t xml:space="preserve">    PLOVILA_NOVO: '/plovila/novo',</w:t>
+        <w:t xml:space="preserve">    PLOVILA_NOVO: '/plovila/</w:t>
+      </w:r>
+      <w:r>
+        <w:rPr>
+          <w:rFonts w:ascii="Courier New" w:eastAsia="Times New Roman" w:hAnsi="Courier New" w:cs="Courier New"/>
+          <w:sz w:val="20"/>
+          <w:szCs w:val="20"/>
+          <w:lang w:eastAsia="hr-HR"/>
+        </w:rPr>
+        <w:t>dodaj</w:t>
+      </w:r>
+      <w:r>
+        <w:rPr>
+          <w:rFonts w:ascii="Courier New" w:eastAsia="Times New Roman" w:hAnsi="Courier New" w:cs="Courier New"/>
+          <w:sz w:val="20"/>
+          <w:szCs w:val="20"/>
+          <w:lang w:eastAsia="hr-HR"/>
+        </w:rPr>
+        <w:t>',</w:t>
       </w:r>
     </w:p>
     <w:p>
@@ -1187,7 +1247,16 @@
           <w:szCs w:val="24"/>
           <w:lang w:eastAsia="hr-HR"/>
         </w:rPr>
-        <w:t>cijena dnevnog najma</w:t>
+        <w:t>datum porinuća</w:t>
+      </w:r>
+      <w:r>
+        <w:rPr>
+          <w:rFonts w:ascii="Times New Roman" w:eastAsia="Times New Roman" w:hAnsi="Times New Roman" w:cs="Times New Roman"/>
+          <w:sz w:val="24"/>
+          <w:szCs w:val="24"/>
+          <w:lang w:eastAsia="hr-HR"/>
+        </w:rPr>
+        <w:t xml:space="preserve"> plovila</w:t>
       </w:r>
     </w:p>
     <w:p>
@@ -1211,7 +1280,7 @@
           <w:szCs w:val="24"/>
           <w:lang w:eastAsia="hr-HR"/>
         </w:rPr>
-        <w:t>dostupnost plovila</w:t>
+        <w:t>cijena dnevnog najma</w:t>
       </w:r>
     </w:p>
     <w:p>
@@ -1235,6 +1304,30 @@
           <w:szCs w:val="24"/>
           <w:lang w:eastAsia="hr-HR"/>
         </w:rPr>
+        <w:t>dostupnost plovila</w:t>
+      </w:r>
+    </w:p>
+    <w:p>
+      <w:pPr>
+        <w:numPr>
+          <w:ilvl w:val="0"/>
+          <w:numId w:val="2"/>
+        </w:numPr>
+        <w:spacing w:before="100" w:beforeAutospacing="1" w:after="100" w:afterAutospacing="1" w:line="240" w:lineRule="auto"/>
+        <w:rPr>
+          <w:rFonts w:ascii="Times New Roman" w:eastAsia="Times New Roman" w:hAnsi="Times New Roman" w:cs="Times New Roman"/>
+          <w:sz w:val="24"/>
+          <w:szCs w:val="24"/>
+          <w:lang w:eastAsia="hr-HR"/>
+        </w:rPr>
+      </w:pPr>
+      <w:r>
+        <w:rPr>
+          <w:rFonts w:ascii="Times New Roman" w:eastAsia="Times New Roman" w:hAnsi="Times New Roman" w:cs="Times New Roman"/>
+          <w:sz w:val="24"/>
+          <w:szCs w:val="24"/>
+          <w:lang w:eastAsia="hr-HR"/>
+        </w:rPr>
         <w:t>akcije (promjena / brisanje)</w:t>
       </w:r>
     </w:p>
@@ -1407,7 +1500,7 @@
           <w:szCs w:val="24"/>
           <w:lang w:eastAsia="hr-HR"/>
         </w:rPr>
-        <w:t>maksimalan broj osoba</w:t>
+        <w:t>cijena dnevnog najma</w:t>
       </w:r>
     </w:p>
     <w:p>
@@ -1431,7 +1524,7 @@
           <w:szCs w:val="24"/>
           <w:lang w:eastAsia="hr-HR"/>
         </w:rPr>
-        <w:t>cijena dnevnog najma</w:t>
+        <w:t>maksimalan broj osoba</w:t>
       </w:r>
     </w:p>
     <w:p>
@@ -1455,6 +1548,39 @@
           <w:szCs w:val="24"/>
           <w:lang w:eastAsia="hr-HR"/>
         </w:rPr>
+        <w:t>da</w:t>
+      </w:r>
+      <w:r>
+        <w:rPr>
+          <w:rFonts w:ascii="Times New Roman" w:eastAsia="Times New Roman" w:hAnsi="Times New Roman" w:cs="Times New Roman"/>
+          <w:sz w:val="24"/>
+          <w:szCs w:val="24"/>
+          <w:lang w:eastAsia="hr-HR"/>
+        </w:rPr>
+        <w:t>tum porinuća plovila</w:t>
+      </w:r>
+    </w:p>
+    <w:p>
+      <w:pPr>
+        <w:numPr>
+          <w:ilvl w:val="0"/>
+          <w:numId w:val="3"/>
+        </w:numPr>
+        <w:spacing w:before="100" w:beforeAutospacing="1" w:after="100" w:afterAutospacing="1" w:line="240" w:lineRule="auto"/>
+        <w:rPr>
+          <w:rFonts w:ascii="Times New Roman" w:eastAsia="Times New Roman" w:hAnsi="Times New Roman" w:cs="Times New Roman"/>
+          <w:sz w:val="24"/>
+          <w:szCs w:val="24"/>
+          <w:lang w:eastAsia="hr-HR"/>
+        </w:rPr>
+      </w:pPr>
+      <w:r>
+        <w:rPr>
+          <w:rFonts w:ascii="Times New Roman" w:eastAsia="Times New Roman" w:hAnsi="Times New Roman" w:cs="Times New Roman"/>
+          <w:sz w:val="24"/>
+          <w:szCs w:val="24"/>
+          <w:lang w:eastAsia="hr-HR"/>
+        </w:rPr>
         <w:t>dostupnost plovila</w:t>
       </w:r>
     </w:p>
@@ -1755,6 +1881,39 @@
           <w:lang w:eastAsia="hr-HR"/>
         </w:rPr>
         <w:t>cijenu najma</w:t>
+      </w:r>
+    </w:p>
+    <w:p>
+      <w:pPr>
+        <w:numPr>
+          <w:ilvl w:val="0"/>
+          <w:numId w:val="5"/>
+        </w:numPr>
+        <w:spacing w:before="100" w:beforeAutospacing="1" w:after="100" w:afterAutospacing="1" w:line="240" w:lineRule="auto"/>
+        <w:rPr>
+          <w:rFonts w:ascii="Times New Roman" w:eastAsia="Times New Roman" w:hAnsi="Times New Roman" w:cs="Times New Roman"/>
+          <w:sz w:val="24"/>
+          <w:szCs w:val="24"/>
+          <w:lang w:eastAsia="hr-HR"/>
+        </w:rPr>
+      </w:pPr>
+      <w:r>
+        <w:rPr>
+          <w:rFonts w:ascii="Times New Roman" w:eastAsia="Times New Roman" w:hAnsi="Times New Roman" w:cs="Times New Roman"/>
+          <w:sz w:val="24"/>
+          <w:szCs w:val="24"/>
+          <w:lang w:eastAsia="hr-HR"/>
+        </w:rPr>
+        <w:t>datum porinuća</w:t>
+      </w:r>
+      <w:r>
+        <w:rPr>
+          <w:rFonts w:ascii="Times New Roman" w:eastAsia="Times New Roman" w:hAnsi="Times New Roman" w:cs="Times New Roman"/>
+          <w:sz w:val="24"/>
+          <w:szCs w:val="24"/>
+          <w:lang w:eastAsia="hr-HR"/>
+        </w:rPr>
+        <w:t xml:space="preserve"> plovila</w:t>
       </w:r>
     </w:p>
     <w:p>
@@ -3414,6 +3573,7 @@
     <w:lsdException w:name="HTML Sample" w:semiHidden="1" w:unhideWhenUsed="1"/>
     <w:lsdException w:name="HTML Typewriter" w:semiHidden="1" w:unhideWhenUsed="1"/>
     <w:lsdException w:name="HTML Variable" w:semiHidden="1" w:unhideWhenUsed="1"/>
+    <w:lsdException w:name="Normal Table" w:semiHidden="1" w:unhideWhenUsed="1"/>
     <w:lsdException w:name="annotation subject" w:semiHidden="1" w:unhideWhenUsed="1"/>
     <w:lsdException w:name="No List" w:semiHidden="1" w:unhideWhenUsed="1"/>
     <w:lsdException w:name="Outline List 1" w:semiHidden="1" w:unhideWhenUsed="1"/>
@@ -3460,8 +3620,10 @@
     <w:lsdException w:name="Table Subtle 2" w:semiHidden="1" w:unhideWhenUsed="1"/>
     <w:lsdException w:name="Table Web 1" w:semiHidden="1" w:unhideWhenUsed="1"/>
     <w:lsdException w:name="Table Web 2" w:semiHidden="1" w:unhideWhenUsed="1"/>
+    <w:lsdException w:name="Table Web 3" w:semiHidden="1" w:unhideWhenUsed="1"/>
     <w:lsdException w:name="Balloon Text" w:semiHidden="1" w:unhideWhenUsed="1"/>
     <w:lsdException w:name="Table Grid" w:uiPriority="39"/>
+    <w:lsdException w:name="Table Theme" w:semiHidden="1" w:unhideWhenUsed="1"/>
     <w:lsdException w:name="Placeholder Text" w:semiHidden="1"/>
     <w:lsdException w:name="No Spacing" w:uiPriority="1" w:qFormat="1"/>
     <w:lsdException w:name="Light Shading" w:uiPriority="60"/>

</xml_diff>